<commit_message>
End of day 30th
</commit_message>
<xml_diff>
--- a/pseudocode/Fast Mutipole.docx
+++ b/pseudocode/Fast Mutipole.docx
@@ -640,6 +640,15 @@
           <w:sz w:val="13"/>
           <w:szCs w:val="13"/>
         </w:rPr>
+        <w:t>›</w:t>
+      </w:r>
+      <w:r>
+        <w:rPr>
+          <w:b/>
+          <w:bCs/>
+          <w:sz w:val="13"/>
+          <w:szCs w:val="13"/>
+        </w:rPr>
         <w:t>(</w:t>
       </w:r>
       <w:r>
@@ -658,6 +667,15 @@
           <w:sz w:val="13"/>
           <w:szCs w:val="13"/>
         </w:rPr>
+        <w:t>, P</w:t>
+      </w:r>
+      <w:r>
+        <w:rPr>
+          <w:b/>
+          <w:bCs/>
+          <w:sz w:val="13"/>
+          <w:szCs w:val="13"/>
+        </w:rPr>
         <w:t>)</w:t>
       </w:r>
       <w:r>
@@ -756,6 +774,15 @@
         <w:tab/>
         <w:t>CALCULATE multipole expansion contribution</w:t>
       </w:r>
+      <w:r>
+        <w:rPr>
+          <w:b/>
+          <w:bCs/>
+          <w:sz w:val="13"/>
+          <w:szCs w:val="13"/>
+        </w:rPr>
+        <w:t xml:space="preserve"> of order P›</w:t>
+      </w:r>
     </w:p>
     <w:p>
       <w:pPr>
@@ -879,27 +906,7 @@
           <w:szCs w:val="13"/>
         </w:rPr>
         <w:tab/>
-        <w:t xml:space="preserve">IF node is NOT </w:t>
-      </w:r>
-      <w:proofErr w:type="gramStart"/>
-      <w:r>
-        <w:rPr>
-          <w:b/>
-          <w:bCs/>
-          <w:sz w:val="13"/>
-          <w:szCs w:val="13"/>
-        </w:rPr>
-        <w:t>leaf</w:t>
-      </w:r>
-      <w:proofErr w:type="gramEnd"/>
-      <w:r>
-        <w:rPr>
-          <w:b/>
-          <w:bCs/>
-          <w:sz w:val="13"/>
-          <w:szCs w:val="13"/>
-        </w:rPr>
-        <w:t xml:space="preserve"> node:</w:t>
+        <w:t>IF node is NOT leaf node:</w:t>
       </w:r>
     </w:p>
     <w:p>
@@ -2715,6 +2722,381 @@
           <w:bCs/>
           <w:sz w:val="13"/>
           <w:szCs w:val="13"/>
+        </w:rPr>
+      </w:pPr>
+    </w:p>
+    <w:p>
+      <w:pPr>
+        <w:rPr>
+          <w:rFonts w:eastAsiaTheme="minorEastAsia"/>
+          <w:b/>
+          <w:bCs/>
+          <w:sz w:val="13"/>
+          <w:szCs w:val="13"/>
+        </w:rPr>
+      </w:pPr>
+    </w:p>
+    <w:p>
+      <w:pPr>
+        <w:rPr>
+          <w:rFonts w:eastAsiaTheme="minorEastAsia"/>
+          <w:b/>
+          <w:bCs/>
+          <w:sz w:val="21"/>
+          <w:szCs w:val="21"/>
+        </w:rPr>
+      </w:pPr>
+    </w:p>
+    <w:p>
+      <w:pPr>
+        <w:rPr>
+          <w:rFonts w:eastAsiaTheme="minorEastAsia"/>
+          <w:b/>
+          <w:bCs/>
+          <w:sz w:val="21"/>
+          <w:szCs w:val="21"/>
+        </w:rPr>
+      </w:pPr>
+    </w:p>
+    <w:p>
+      <w:pPr>
+        <w:rPr>
+          <w:rFonts w:eastAsiaTheme="minorEastAsia"/>
+          <w:b/>
+          <w:bCs/>
+          <w:sz w:val="21"/>
+          <w:szCs w:val="21"/>
+        </w:rPr>
+      </w:pPr>
+    </w:p>
+    <w:p>
+      <w:pPr>
+        <w:rPr>
+          <w:rFonts w:eastAsiaTheme="minorEastAsia"/>
+          <w:b/>
+          <w:bCs/>
+          <w:sz w:val="21"/>
+          <w:szCs w:val="21"/>
+        </w:rPr>
+      </w:pPr>
+    </w:p>
+    <w:p>
+      <w:pPr>
+        <w:rPr>
+          <w:rFonts w:eastAsiaTheme="minorEastAsia"/>
+          <w:b/>
+          <w:bCs/>
+        </w:rPr>
+      </w:pPr>
+      <w:r>
+        <w:rPr>
+          <w:rFonts w:eastAsiaTheme="minorEastAsia"/>
+          <w:b/>
+          <w:bCs/>
+        </w:rPr>
+        <w:lastRenderedPageBreak/>
+        <w:t>FUNCTION system_acceleration</w:t>
+      </w:r>
+      <w:r>
+        <w:rPr>
+          <w:rFonts w:eastAsiaTheme="minorEastAsia"/>
+          <w:b/>
+          <w:bCs/>
+        </w:rPr>
+        <w:t>(particle_system, P, N):</w:t>
+      </w:r>
+    </w:p>
+    <w:p>
+      <w:pPr>
+        <w:rPr>
+          <w:rFonts w:eastAsiaTheme="minorEastAsia"/>
+          <w:b/>
+          <w:bCs/>
+        </w:rPr>
+      </w:pPr>
+      <w:r>
+        <w:rPr>
+          <w:rFonts w:eastAsiaTheme="minorEastAsia"/>
+          <w:b/>
+          <w:bCs/>
+        </w:rPr>
+        <w:tab/>
+        <w:t xml:space="preserve">SET max_depth = </w:t>
+      </w:r>
+      <m:oMath>
+        <m:r>
+          <m:rPr>
+            <m:sty m:val="b"/>
+          </m:rPr>
+          <w:rPr>
+            <w:rFonts w:ascii="Cambria Math" w:eastAsiaTheme="minorEastAsia" w:hAnsi="Cambria Math"/>
+          </w:rPr>
+          <m:t>⌈</m:t>
+        </m:r>
+        <m:func>
+          <m:funcPr>
+            <m:ctrlPr>
+              <w:rPr>
+                <w:rFonts w:ascii="Cambria Math" w:eastAsiaTheme="minorEastAsia" w:hAnsi="Cambria Math"/>
+                <w:b/>
+                <w:bCs/>
+              </w:rPr>
+            </m:ctrlPr>
+          </m:funcPr>
+          <m:fName>
+            <m:sSub>
+              <m:sSubPr>
+                <m:ctrlPr>
+                  <w:rPr>
+                    <w:rFonts w:ascii="Cambria Math" w:eastAsiaTheme="minorEastAsia" w:hAnsi="Cambria Math"/>
+                    <w:b/>
+                    <w:bCs/>
+                    <w:i/>
+                  </w:rPr>
+                </m:ctrlPr>
+              </m:sSubPr>
+              <m:e>
+                <m:r>
+                  <m:rPr>
+                    <m:sty m:val="b"/>
+                  </m:rPr>
+                  <w:rPr>
+                    <w:rFonts w:ascii="Cambria Math" w:eastAsiaTheme="minorEastAsia" w:hAnsi="Cambria Math"/>
+                  </w:rPr>
+                  <m:t>log</m:t>
+                </m:r>
+                <m:ctrlPr>
+                  <w:rPr>
+                    <w:rFonts w:ascii="Cambria Math" w:eastAsiaTheme="minorEastAsia" w:hAnsi="Cambria Math"/>
+                    <w:b/>
+                    <w:bCs/>
+                  </w:rPr>
+                </m:ctrlPr>
+              </m:e>
+              <m:sub>
+                <m:r>
+                  <m:rPr>
+                    <m:sty m:val="bi"/>
+                  </m:rPr>
+                  <w:rPr>
+                    <w:rFonts w:ascii="Cambria Math" w:eastAsiaTheme="minorEastAsia" w:hAnsi="Cambria Math"/>
+                  </w:rPr>
+                  <m:t>8</m:t>
+                </m:r>
+                <m:ctrlPr>
+                  <w:rPr>
+                    <w:rFonts w:ascii="Cambria Math" w:eastAsiaTheme="minorEastAsia" w:hAnsi="Cambria Math"/>
+                    <w:b/>
+                    <w:bCs/>
+                  </w:rPr>
+                </m:ctrlPr>
+              </m:sub>
+            </m:sSub>
+          </m:fName>
+          <m:e>
+            <m:d>
+              <m:dPr>
+                <m:ctrlPr>
+                  <w:rPr>
+                    <w:rFonts w:ascii="Cambria Math" w:eastAsiaTheme="minorEastAsia" w:hAnsi="Cambria Math"/>
+                    <w:b/>
+                    <w:bCs/>
+                    <w:i/>
+                  </w:rPr>
+                </m:ctrlPr>
+              </m:dPr>
+              <m:e>
+                <m:r>
+                  <m:rPr>
+                    <m:sty m:val="bi"/>
+                  </m:rPr>
+                  <w:rPr>
+                    <w:rFonts w:ascii="Cambria Math" w:eastAsiaTheme="minorEastAsia" w:hAnsi="Cambria Math"/>
+                  </w:rPr>
+                  <m:t>N</m:t>
+                </m:r>
+              </m:e>
+            </m:d>
+            <m:ctrlPr>
+              <w:rPr>
+                <w:rFonts w:ascii="Cambria Math" w:eastAsiaTheme="minorEastAsia" w:hAnsi="Cambria Math"/>
+                <w:b/>
+                <w:bCs/>
+                <w:i/>
+              </w:rPr>
+            </m:ctrlPr>
+          </m:e>
+        </m:func>
+        <m:r>
+          <m:rPr>
+            <m:sty m:val="b"/>
+          </m:rPr>
+          <w:rPr>
+            <w:rFonts w:ascii="Cambria Math" w:eastAsiaTheme="minorEastAsia" w:hAnsi="Cambria Math"/>
+          </w:rPr>
+          <m:t>⌉</m:t>
+        </m:r>
+      </m:oMath>
+    </w:p>
+    <w:p>
+      <w:pPr>
+        <w:rPr>
+          <w:b/>
+          <w:bCs/>
+          <w:sz w:val="32"/>
+          <w:szCs w:val="32"/>
+        </w:rPr>
+      </w:pPr>
+      <w:r>
+        <w:rPr>
+          <w:rFonts w:eastAsiaTheme="minorEastAsia"/>
+          <w:b/>
+          <w:bCs/>
+        </w:rPr>
+        <w:tab/>
+        <w:t xml:space="preserve">SET tree =  </w:t>
+      </w:r>
+      <w:r>
+        <w:rPr>
+          <w:b/>
+          <w:bCs/>
+        </w:rPr>
+        <w:t>construct_tree(particle_system, max_depth)</w:t>
+      </w:r>
+    </w:p>
+    <w:p>
+      <w:pPr>
+        <w:rPr>
+          <w:b/>
+          <w:bCs/>
+          <w:sz w:val="32"/>
+          <w:szCs w:val="32"/>
+        </w:rPr>
+      </w:pPr>
+      <w:r>
+        <w:rPr>
+          <w:b/>
+          <w:bCs/>
+          <w:sz w:val="32"/>
+          <w:szCs w:val="32"/>
+        </w:rPr>
+        <w:tab/>
+      </w:r>
+      <w:r>
+        <w:rPr>
+          <w:b/>
+          <w:bCs/>
+        </w:rPr>
+        <w:t>CALL fill_tree(</w:t>
+      </w:r>
+      <w:r>
+        <w:rPr>
+          <w:rFonts w:eastAsiaTheme="minorEastAsia"/>
+          <w:b/>
+          <w:bCs/>
+        </w:rPr>
+        <w:t>particle_system,</w:t>
+      </w:r>
+      <w:r>
+        <w:rPr>
+          <w:rFonts w:eastAsiaTheme="minorEastAsia"/>
+          <w:b/>
+          <w:bCs/>
+          <w:sz w:val="21"/>
+          <w:szCs w:val="21"/>
+        </w:rPr>
+        <w:t xml:space="preserve"> </w:t>
+      </w:r>
+      <w:r>
+        <w:rPr>
+          <w:b/>
+          <w:bCs/>
+        </w:rPr>
+        <w:t>tree)</w:t>
+      </w:r>
+    </w:p>
+    <w:p>
+      <w:pPr>
+        <w:rPr>
+          <w:b/>
+          <w:bCs/>
+        </w:rPr>
+      </w:pPr>
+      <w:r>
+        <w:rPr>
+          <w:b/>
+          <w:bCs/>
+          <w:sz w:val="32"/>
+          <w:szCs w:val="32"/>
+        </w:rPr>
+        <w:tab/>
+      </w:r>
+      <w:r>
+        <w:rPr>
+          <w:b/>
+          <w:bCs/>
+        </w:rPr>
+        <w:t>CALL upwards_pass(tree, P)</w:t>
+      </w:r>
+    </w:p>
+    <w:p>
+      <w:pPr>
+        <w:rPr>
+          <w:rFonts w:eastAsiaTheme="minorEastAsia"/>
+          <w:b/>
+          <w:bCs/>
+          <w:sz w:val="21"/>
+          <w:szCs w:val="21"/>
+        </w:rPr>
+      </w:pPr>
+      <w:r>
+        <w:rPr>
+          <w:b/>
+          <w:bCs/>
+        </w:rPr>
+        <w:tab/>
+        <w:t>C</w:t>
+      </w:r>
+      <w:r>
+        <w:rPr>
+          <w:b/>
+          <w:bCs/>
+        </w:rPr>
+        <w:t>ALL downwards_pass(tree)</w:t>
+      </w:r>
+    </w:p>
+    <w:p>
+      <w:pPr>
+        <w:rPr>
+          <w:rFonts w:eastAsiaTheme="minorEastAsia"/>
+          <w:b/>
+          <w:bCs/>
+        </w:rPr>
+      </w:pPr>
+      <w:r>
+        <w:rPr>
+          <w:rFonts w:eastAsiaTheme="minorEastAsia"/>
+          <w:b/>
+          <w:bCs/>
+        </w:rPr>
+        <w:t>END</w:t>
+      </w:r>
+    </w:p>
+    <w:p>
+      <w:pPr>
+        <w:rPr>
+          <w:rFonts w:eastAsiaTheme="minorEastAsia"/>
+          <w:b/>
+          <w:bCs/>
+        </w:rPr>
+      </w:pPr>
+    </w:p>
+    <w:p>
+      <w:pPr>
+        <w:rPr>
+          <w:rFonts w:eastAsiaTheme="minorEastAsia"/>
+          <w:b/>
+          <w:bCs/>
         </w:rPr>
       </w:pPr>
     </w:p>

</xml_diff>